<commit_message>
Deploying to gh-pages from @ Morrison-Lab/mds@05d162d13a6e29aab6e61ec8f8a1faf1dcfe739d 🚀
</commit_message>
<xml_diff>
--- a/linear-algebra-vectors.docx
+++ b/linear-algebra-vectors.docx
@@ -15,7 +15,7 @@
         <w:pStyle w:val="Date"/>
       </w:pPr>
       <w:r>
-        <w:t xml:space="preserve">Last modified: 2026-10-19 12:33:15 (PDT)</w:t>
+        <w:t xml:space="preserve">Last modified: 2026-10-19 23:31:34 (PDT)</w:t>
       </w:r>
     </w:p>
     <w:bookmarkStart w:id="110" w:name="vectors"/>
@@ -9577,31 +9577,339 @@
       </w:r>
       <w:r>
         <w:rPr>
+          <w:rStyle w:val="NormalTok"/>
+        </w:rPr>
+        <w:t xml:space="preserve">inner </w:t>
+      </w:r>
+      <w:r>
+        <w:rPr>
+          <w:rStyle w:val="OperatorTok"/>
+        </w:rPr>
+        <w:t xml:space="preserve">=</w:t>
+      </w:r>
+      <w:r>
+        <w:rPr>
+          <w:rStyle w:val="NormalTok"/>
+        </w:rPr>
+        <w:t xml:space="preserve"> </w:t>
+      </w:r>
+      <w:r>
+        <w:rPr>
           <w:rStyle w:val="BuiltInTok"/>
         </w:rPr>
+        <w:t xml:space="preserve">float</w:t>
+      </w:r>
+      <w:r>
+        <w:rPr>
+          <w:rStyle w:val="NormalTok"/>
+        </w:rPr>
+        <w:t xml:space="preserve">(a </w:t>
+      </w:r>
+      <w:r>
+        <w:rPr>
+          <w:rStyle w:val="OperatorTok"/>
+        </w:rPr>
+        <w:t xml:space="preserve">@</w:t>
+      </w:r>
+      <w:r>
+        <w:rPr>
+          <w:rStyle w:val="NormalTok"/>
+        </w:rPr>
+        <w:t xml:space="preserve"> b)</w:t>
+      </w:r>
+      <w:r>
+        <w:br/>
+      </w:r>
+      <w:r>
+        <w:rPr>
+          <w:rStyle w:val="NormalTok"/>
+        </w:rPr>
+        <w:t xml:space="preserve">norm_a </w:t>
+      </w:r>
+      <w:r>
+        <w:rPr>
+          <w:rStyle w:val="OperatorTok"/>
+        </w:rPr>
+        <w:t xml:space="preserve">=</w:t>
+      </w:r>
+      <w:r>
+        <w:rPr>
+          <w:rStyle w:val="NormalTok"/>
+        </w:rPr>
+        <w:t xml:space="preserve"> </w:t>
+      </w:r>
+      <w:r>
+        <w:rPr>
+          <w:rStyle w:val="BuiltInTok"/>
+        </w:rPr>
+        <w:t xml:space="preserve">round</w:t>
+      </w:r>
+      <w:r>
+        <w:rPr>
+          <w:rStyle w:val="NormalTok"/>
+        </w:rPr>
+        <w:t xml:space="preserve">(</w:t>
+      </w:r>
+      <w:r>
+        <w:rPr>
+          <w:rStyle w:val="BuiltInTok"/>
+        </w:rPr>
+        <w:t xml:space="preserve">float</w:t>
+      </w:r>
+      <w:r>
+        <w:rPr>
+          <w:rStyle w:val="NormalTok"/>
+        </w:rPr>
+        <w:t xml:space="preserve">(np.linalg.norm(a)), </w:t>
+      </w:r>
+      <w:r>
+        <w:rPr>
+          <w:rStyle w:val="DecValTok"/>
+        </w:rPr>
+        <w:t xml:space="preserve">3</w:t>
+      </w:r>
+      <w:r>
+        <w:rPr>
+          <w:rStyle w:val="NormalTok"/>
+        </w:rPr>
+        <w:t xml:space="preserve">)</w:t>
+      </w:r>
+      <w:r>
+        <w:br/>
+      </w:r>
+      <w:r>
+        <w:br/>
+      </w:r>
+      <w:r>
+        <w:rPr>
+          <w:rStyle w:val="BuiltInTok"/>
+        </w:rPr>
         <w:t xml:space="preserve">print</w:t>
       </w:r>
       <w:r>
         <w:rPr>
           <w:rStyle w:val="NormalTok"/>
         </w:rPr>
+        <w:t xml:space="preserve">(inner, norm_a)</w:t>
+      </w:r>
+      <w:r>
+        <w:br/>
+      </w:r>
+      <w:r>
+        <w:rPr>
+          <w:rStyle w:val="CommentTok"/>
+        </w:rPr>
+        <w:t xml:space="preserve">#&gt; -8.0 3.742</w:t>
+      </w:r>
+    </w:p>
+    <w:p>
+      <w:pPr>
+        <w:pStyle w:val="SourceCode"/>
+      </w:pPr>
+      <w:r>
+        <w:rPr>
+          <w:rStyle w:val="NormalTok"/>
+        </w:rPr>
+        <w:t xml:space="preserve">a </w:t>
+      </w:r>
+      <w:r>
+        <w:rPr>
+          <w:rStyle w:val="OtherTok"/>
+        </w:rPr>
+        <w:t xml:space="preserve">&lt;-</w:t>
+      </w:r>
+      <w:r>
+        <w:rPr>
+          <w:rStyle w:val="NormalTok"/>
+        </w:rPr>
+        <w:t xml:space="preserve"> </w:t>
+      </w:r>
+      <w:r>
+        <w:rPr>
+          <w:rStyle w:val="FunctionTok"/>
+        </w:rPr>
+        <w:t xml:space="preserve">c</w:t>
+      </w:r>
+      <w:r>
+        <w:rPr>
+          <w:rStyle w:val="NormalTok"/>
+        </w:rPr>
+        <w:t xml:space="preserve">(</w:t>
+      </w:r>
+      <w:r>
+        <w:rPr>
+          <w:rStyle w:val="DecValTok"/>
+        </w:rPr>
+        <w:t xml:space="preserve">3</w:t>
+      </w:r>
+      <w:r>
+        <w:rPr>
+          <w:rStyle w:val="NormalTok"/>
+        </w:rPr>
+        <w:t xml:space="preserve">, </w:t>
+      </w:r>
+      <w:r>
+        <w:rPr>
+          <w:rStyle w:val="SpecialCharTok"/>
+        </w:rPr>
+        <w:t xml:space="preserve">-</w:t>
+      </w:r>
+      <w:r>
+        <w:rPr>
+          <w:rStyle w:val="DecValTok"/>
+        </w:rPr>
+        <w:t xml:space="preserve">1</w:t>
+      </w:r>
+      <w:r>
+        <w:rPr>
+          <w:rStyle w:val="NormalTok"/>
+        </w:rPr>
+        <w:t xml:space="preserve">, </w:t>
+      </w:r>
+      <w:r>
+        <w:rPr>
+          <w:rStyle w:val="DecValTok"/>
+        </w:rPr>
+        <w:t xml:space="preserve">2</w:t>
+      </w:r>
+      <w:r>
+        <w:rPr>
+          <w:rStyle w:val="NormalTok"/>
+        </w:rPr>
+        <w:t xml:space="preserve">)</w:t>
+      </w:r>
+      <w:r>
+        <w:br/>
+      </w:r>
+      <w:r>
+        <w:rPr>
+          <w:rStyle w:val="NormalTok"/>
+        </w:rPr>
+        <w:t xml:space="preserve">b </w:t>
+      </w:r>
+      <w:r>
+        <w:rPr>
+          <w:rStyle w:val="OtherTok"/>
+        </w:rPr>
+        <w:t xml:space="preserve">&lt;-</w:t>
+      </w:r>
+      <w:r>
+        <w:rPr>
+          <w:rStyle w:val="NormalTok"/>
+        </w:rPr>
+        <w:t xml:space="preserve"> </w:t>
+      </w:r>
+      <w:r>
+        <w:rPr>
+          <w:rStyle w:val="FunctionTok"/>
+        </w:rPr>
+        <w:t xml:space="preserve">c</w:t>
+      </w:r>
+      <w:r>
+        <w:rPr>
+          <w:rStyle w:val="NormalTok"/>
+        </w:rPr>
+        <w:t xml:space="preserve">(</w:t>
+      </w:r>
+      <w:r>
+        <w:rPr>
+          <w:rStyle w:val="DecValTok"/>
+        </w:rPr>
+        <w:t xml:space="preserve">0</w:t>
+      </w:r>
+      <w:r>
+        <w:rPr>
+          <w:rStyle w:val="NormalTok"/>
+        </w:rPr>
+        <w:t xml:space="preserve">, </w:t>
+      </w:r>
+      <w:r>
+        <w:rPr>
+          <w:rStyle w:val="DecValTok"/>
+        </w:rPr>
+        <w:t xml:space="preserve">4</w:t>
+      </w:r>
+      <w:r>
+        <w:rPr>
+          <w:rStyle w:val="NormalTok"/>
+        </w:rPr>
+        <w:t xml:space="preserve">, </w:t>
+      </w:r>
+      <w:r>
+        <w:rPr>
+          <w:rStyle w:val="SpecialCharTok"/>
+        </w:rPr>
+        <w:t xml:space="preserve">-</w:t>
+      </w:r>
+      <w:r>
+        <w:rPr>
+          <w:rStyle w:val="DecValTok"/>
+        </w:rPr>
+        <w:t xml:space="preserve">2</w:t>
+      </w:r>
+      <w:r>
+        <w:rPr>
+          <w:rStyle w:val="NormalTok"/>
+        </w:rPr>
+        <w:t xml:space="preserve">)</w:t>
+      </w:r>
+      <w:r>
+        <w:br/>
+      </w:r>
+      <w:r>
+        <w:br/>
+      </w:r>
+      <w:r>
+        <w:rPr>
+          <w:rStyle w:val="FunctionTok"/>
+        </w:rPr>
+        <w:t xml:space="preserve">print</w:t>
+      </w:r>
+      <w:r>
+        <w:rPr>
+          <w:rStyle w:val="NormalTok"/>
+        </w:rPr>
+        <w:t xml:space="preserve">(</w:t>
+      </w:r>
+      <w:r>
+        <w:rPr>
+          <w:rStyle w:val="FunctionTok"/>
+        </w:rPr>
+        <w:t xml:space="preserve">c</w:t>
+      </w:r>
+      <w:r>
+        <w:rPr>
+          <w:rStyle w:val="NormalTok"/>
+        </w:rPr>
+        <w:t xml:space="preserve">(</w:t>
+      </w:r>
+      <w:r>
+        <w:rPr>
+          <w:rStyle w:val="FunctionTok"/>
+        </w:rPr>
+        <w:t xml:space="preserve">sum</w:t>
+      </w:r>
+      <w:r>
+        <w:rPr>
+          <w:rStyle w:val="NormalTok"/>
+        </w:rPr>
         <w:t xml:space="preserve">(a </w:t>
       </w:r>
       <w:r>
         <w:rPr>
-          <w:rStyle w:val="OperatorTok"/>
-        </w:rPr>
-        <w:t xml:space="preserve">@</w:t>
+          <w:rStyle w:val="SpecialCharTok"/>
+        </w:rPr>
+        <w:t xml:space="preserve">*</w:t>
       </w:r>
       <w:r>
         <w:rPr>
           <w:rStyle w:val="NormalTok"/>
         </w:rPr>
-        <w:t xml:space="preserve"> b, </w:t>
-      </w:r>
-      <w:r>
-        <w:rPr>
-          <w:rStyle w:val="BuiltInTok"/>
+        <w:t xml:space="preserve"> b), </w:t>
+      </w:r>
+      <w:r>
+        <w:rPr>
+          <w:rStyle w:val="FunctionTok"/>
         </w:rPr>
         <w:t xml:space="preserve">round</w:t>
       </w:r>
@@ -9613,305 +9921,63 @@
       </w:r>
       <w:r>
         <w:rPr>
-          <w:rStyle w:val="BuiltInTok"/>
-        </w:rPr>
-        <w:t xml:space="preserve">float</w:t>
+          <w:rStyle w:val="FunctionTok"/>
+        </w:rPr>
+        <w:t xml:space="preserve">sqrt</w:t>
       </w:r>
       <w:r>
         <w:rPr>
           <w:rStyle w:val="NormalTok"/>
         </w:rPr>
-        <w:t xml:space="preserve">(np.linalg.norm(a)), </w:t>
+        <w:t xml:space="preserve">(</w:t>
+      </w:r>
+      <w:r>
+        <w:rPr>
+          <w:rStyle w:val="FunctionTok"/>
+        </w:rPr>
+        <w:t xml:space="preserve">sum</w:t>
+      </w:r>
+      <w:r>
+        <w:rPr>
+          <w:rStyle w:val="NormalTok"/>
+        </w:rPr>
+        <w:t xml:space="preserve">(a</w:t>
+      </w:r>
+      <w:r>
+        <w:rPr>
+          <w:rStyle w:val="SpecialCharTok"/>
+        </w:rPr>
+        <w:t xml:space="preserve">^</w:t>
       </w:r>
       <w:r>
         <w:rPr>
           <w:rStyle w:val="DecValTok"/>
         </w:rPr>
+        <w:t xml:space="preserve">2</w:t>
+      </w:r>
+      <w:r>
+        <w:rPr>
+          <w:rStyle w:val="NormalTok"/>
+        </w:rPr>
+        <w:t xml:space="preserve">)), </w:t>
+      </w:r>
+      <w:r>
+        <w:rPr>
+          <w:rStyle w:val="DecValTok"/>
+        </w:rPr>
         <w:t xml:space="preserve">3</w:t>
       </w:r>
       <w:r>
         <w:rPr>
           <w:rStyle w:val="NormalTok"/>
         </w:rPr>
-        <w:t xml:space="preserve">))</w:t>
-      </w:r>
-    </w:p>
-    <w:p>
-      <w:pPr>
-        <w:pStyle w:val="SourceCode"/>
-      </w:pPr>
-      <w:r>
-        <w:rPr>
-          <w:rStyle w:val="NormalTok"/>
-        </w:rPr>
-        <w:t xml:space="preserve">a </w:t>
-      </w:r>
-      <w:r>
-        <w:rPr>
-          <w:rStyle w:val="OtherTok"/>
-        </w:rPr>
-        <w:t xml:space="preserve">&lt;-</w:t>
-      </w:r>
-      <w:r>
-        <w:rPr>
-          <w:rStyle w:val="NormalTok"/>
-        </w:rPr>
-        <w:t xml:space="preserve"> </w:t>
-      </w:r>
-      <w:r>
-        <w:rPr>
-          <w:rStyle w:val="FunctionTok"/>
-        </w:rPr>
-        <w:t xml:space="preserve">c</w:t>
-      </w:r>
-      <w:r>
-        <w:rPr>
-          <w:rStyle w:val="NormalTok"/>
-        </w:rPr>
-        <w:t xml:space="preserve">(</w:t>
-      </w:r>
-      <w:r>
-        <w:rPr>
-          <w:rStyle w:val="DecValTok"/>
-        </w:rPr>
-        <w:t xml:space="preserve">3</w:t>
-      </w:r>
-      <w:r>
-        <w:rPr>
-          <w:rStyle w:val="NormalTok"/>
-        </w:rPr>
-        <w:t xml:space="preserve">, </w:t>
-      </w:r>
-      <w:r>
-        <w:rPr>
-          <w:rStyle w:val="SpecialCharTok"/>
-        </w:rPr>
-        <w:t xml:space="preserve">-</w:t>
-      </w:r>
-      <w:r>
-        <w:rPr>
-          <w:rStyle w:val="DecValTok"/>
-        </w:rPr>
-        <w:t xml:space="preserve">1</w:t>
-      </w:r>
-      <w:r>
-        <w:rPr>
-          <w:rStyle w:val="NormalTok"/>
-        </w:rPr>
-        <w:t xml:space="preserve">, </w:t>
-      </w:r>
-      <w:r>
-        <w:rPr>
-          <w:rStyle w:val="DecValTok"/>
-        </w:rPr>
-        <w:t xml:space="preserve">2</w:t>
-      </w:r>
-      <w:r>
-        <w:rPr>
-          <w:rStyle w:val="NormalTok"/>
-        </w:rPr>
-        <w:t xml:space="preserve">)</w:t>
+        <w:t xml:space="preserve">)))</w:t>
       </w:r>
       <w:r>
         <w:br/>
       </w:r>
       <w:r>
         <w:rPr>
-          <w:rStyle w:val="NormalTok"/>
-        </w:rPr>
-        <w:t xml:space="preserve">b </w:t>
-      </w:r>
-      <w:r>
-        <w:rPr>
-          <w:rStyle w:val="OtherTok"/>
-        </w:rPr>
-        <w:t xml:space="preserve">&lt;-</w:t>
-      </w:r>
-      <w:r>
-        <w:rPr>
-          <w:rStyle w:val="NormalTok"/>
-        </w:rPr>
-        <w:t xml:space="preserve"> </w:t>
-      </w:r>
-      <w:r>
-        <w:rPr>
-          <w:rStyle w:val="FunctionTok"/>
-        </w:rPr>
-        <w:t xml:space="preserve">c</w:t>
-      </w:r>
-      <w:r>
-        <w:rPr>
-          <w:rStyle w:val="NormalTok"/>
-        </w:rPr>
-        <w:t xml:space="preserve">(</w:t>
-      </w:r>
-      <w:r>
-        <w:rPr>
-          <w:rStyle w:val="DecValTok"/>
-        </w:rPr>
-        <w:t xml:space="preserve">0</w:t>
-      </w:r>
-      <w:r>
-        <w:rPr>
-          <w:rStyle w:val="NormalTok"/>
-        </w:rPr>
-        <w:t xml:space="preserve">, </w:t>
-      </w:r>
-      <w:r>
-        <w:rPr>
-          <w:rStyle w:val="DecValTok"/>
-        </w:rPr>
-        <w:t xml:space="preserve">4</w:t>
-      </w:r>
-      <w:r>
-        <w:rPr>
-          <w:rStyle w:val="NormalTok"/>
-        </w:rPr>
-        <w:t xml:space="preserve">, </w:t>
-      </w:r>
-      <w:r>
-        <w:rPr>
-          <w:rStyle w:val="SpecialCharTok"/>
-        </w:rPr>
-        <w:t xml:space="preserve">-</w:t>
-      </w:r>
-      <w:r>
-        <w:rPr>
-          <w:rStyle w:val="DecValTok"/>
-        </w:rPr>
-        <w:t xml:space="preserve">2</w:t>
-      </w:r>
-      <w:r>
-        <w:rPr>
-          <w:rStyle w:val="NormalTok"/>
-        </w:rPr>
-        <w:t xml:space="preserve">)</w:t>
-      </w:r>
-      <w:r>
-        <w:br/>
-      </w:r>
-      <w:r>
-        <w:br/>
-      </w:r>
-      <w:r>
-        <w:rPr>
-          <w:rStyle w:val="FunctionTok"/>
-        </w:rPr>
-        <w:t xml:space="preserve">print</w:t>
-      </w:r>
-      <w:r>
-        <w:rPr>
-          <w:rStyle w:val="NormalTok"/>
-        </w:rPr>
-        <w:t xml:space="preserve">(</w:t>
-      </w:r>
-      <w:r>
-        <w:rPr>
-          <w:rStyle w:val="FunctionTok"/>
-        </w:rPr>
-        <w:t xml:space="preserve">c</w:t>
-      </w:r>
-      <w:r>
-        <w:rPr>
-          <w:rStyle w:val="NormalTok"/>
-        </w:rPr>
-        <w:t xml:space="preserve">(</w:t>
-      </w:r>
-      <w:r>
-        <w:rPr>
-          <w:rStyle w:val="FunctionTok"/>
-        </w:rPr>
-        <w:t xml:space="preserve">sum</w:t>
-      </w:r>
-      <w:r>
-        <w:rPr>
-          <w:rStyle w:val="NormalTok"/>
-        </w:rPr>
-        <w:t xml:space="preserve">(a </w:t>
-      </w:r>
-      <w:r>
-        <w:rPr>
-          <w:rStyle w:val="SpecialCharTok"/>
-        </w:rPr>
-        <w:t xml:space="preserve">*</w:t>
-      </w:r>
-      <w:r>
-        <w:rPr>
-          <w:rStyle w:val="NormalTok"/>
-        </w:rPr>
-        <w:t xml:space="preserve"> b), </w:t>
-      </w:r>
-      <w:r>
-        <w:rPr>
-          <w:rStyle w:val="FunctionTok"/>
-        </w:rPr>
-        <w:t xml:space="preserve">round</w:t>
-      </w:r>
-      <w:r>
-        <w:rPr>
-          <w:rStyle w:val="NormalTok"/>
-        </w:rPr>
-        <w:t xml:space="preserve">(</w:t>
-      </w:r>
-      <w:r>
-        <w:rPr>
-          <w:rStyle w:val="FunctionTok"/>
-        </w:rPr>
-        <w:t xml:space="preserve">sqrt</w:t>
-      </w:r>
-      <w:r>
-        <w:rPr>
-          <w:rStyle w:val="NormalTok"/>
-        </w:rPr>
-        <w:t xml:space="preserve">(</w:t>
-      </w:r>
-      <w:r>
-        <w:rPr>
-          <w:rStyle w:val="FunctionTok"/>
-        </w:rPr>
-        <w:t xml:space="preserve">sum</w:t>
-      </w:r>
-      <w:r>
-        <w:rPr>
-          <w:rStyle w:val="NormalTok"/>
-        </w:rPr>
-        <w:t xml:space="preserve">(a</w:t>
-      </w:r>
-      <w:r>
-        <w:rPr>
-          <w:rStyle w:val="SpecialCharTok"/>
-        </w:rPr>
-        <w:t xml:space="preserve">^</w:t>
-      </w:r>
-      <w:r>
-        <w:rPr>
-          <w:rStyle w:val="DecValTok"/>
-        </w:rPr>
-        <w:t xml:space="preserve">2</w:t>
-      </w:r>
-      <w:r>
-        <w:rPr>
-          <w:rStyle w:val="NormalTok"/>
-        </w:rPr>
-        <w:t xml:space="preserve">)), </w:t>
-      </w:r>
-      <w:r>
-        <w:rPr>
-          <w:rStyle w:val="DecValTok"/>
-        </w:rPr>
-        <w:t xml:space="preserve">3</w:t>
-      </w:r>
-      <w:r>
-        <w:rPr>
-          <w:rStyle w:val="NormalTok"/>
-        </w:rPr>
-        <w:t xml:space="preserve">)))</w:t>
-      </w:r>
-      <w:r>
-        <w:br/>
-      </w:r>
-      <w:r>
-        <w:rPr>
           <w:rStyle w:val="CommentTok"/>
         </w:rPr>
         <w:t xml:space="preserve">#&gt; [1] -8.000  3.742</w:t>
@@ -9922,38 +9988,7 @@
         <w:pStyle w:val="FirstParagraph"/>
       </w:pPr>
       <w:r>
-        <w:t xml:space="preserve">Both print</w:t>
-      </w:r>
-      <w:r>
-        <w:t xml:space="preserve"> </w:t>
-      </w:r>
-      <m:oMath>
-        <m:r>
-          <m:rPr>
-            <m:sty m:val="p"/>
-          </m:rPr>
-          <m:t>−</m:t>
-        </m:r>
-        <m:r>
-          <m:t>8</m:t>
-        </m:r>
-      </m:oMath>
-      <w:r>
-        <w:t xml:space="preserve"> </w:t>
-      </w:r>
-      <w:r>
-        <w:t xml:space="preserve">and</w:t>
-      </w:r>
-      <w:r>
-        <w:t xml:space="preserve"> </w:t>
-      </w:r>
-      <m:oMath>
-        <m:r>
-          <m:t>3.742</m:t>
-        </m:r>
-      </m:oMath>
-      <w:r>
-        <w:t xml:space="preserve">.</w:t>
+        <w:t xml:space="preserve">Both print -8 and 3.742.</w:t>
       </w:r>
     </w:p>
     <w:bookmarkEnd w:id="76"/>

</xml_diff>